<commit_message>
Document complete ZAP finding coverage
</commit_message>
<xml_diff>
--- a/deliverables/StudyFlow_Assignment3_Report.docx
+++ b/deliverables/StudyFlow_Assignment3_Report.docx
@@ -5582,6 +5582,11 @@
       </w:r>
     </w:p>
     <w:p>
+      <w:r>
+        <w:t>The headless ZAP baseline scan reported 9 alerts: 0 high, 2 medium, 5 low, and 2 informational. Both medium-severity findings are remediated below with configuration snippets. The five low-severity alerts (Cross-Origin-Embedder-Policy, Cross-Origin-Opener-Policy, Cross-Origin-Resource-Policy, Permissions-Policy, and X-Content-Type-Options headers) are addressed by the same security-header changes as defense in depth. The informational alerts require no remediation.</w:t>
+      </w:r>
+    </w:p>
+    <w:p>
       <w:pPr>
         <w:pStyle w:val="Heading2"/>
       </w:pPr>
@@ -6048,7 +6053,7 @@
               <w:rPr>
                 <w:sz w:val="20"/>
               </w:rPr>
-              <w:t>The July 15, 2026 after-scan crawled six URLs. Its only remaining alerts are informational: Modern Web Application and Storable but Non-Cacheable Content. The two required medium findings are absent from the final JSON and HTML reports.</w:t>
+              <w:t>The July 15, 2026 after-scan crawled six URLs. Its only remaining alerts are informational: Modern Web Application and Storable but Non-Cacheable Content. The two required medium findings are absent from the final JSON and HTML reports. The content alert changed from 'Storable and Cacheable' to 'Storable but Non-Cacheable' because the new Cache-Control headers took effect.</w:t>
             </w:r>
           </w:p>
         </w:tc>

</xml_diff>